<commit_message>
Phase 6: publish descriptive research deliverables
</commit_message>
<xml_diff>
--- a/outputs/reports/ZilaLens_Concept_Note.docx
+++ b/outputs/reports/ZilaLens_Concept_Note.docx
@@ -56,12 +56,12 @@
           <w:b/>
           <w:color w:val="C47F17"/>
         </w:rPr>
-        <w:t>CONCEPT NOTE DRAFT | DISTRICT SELECTION PENDING</w:t>
+        <w:t>CONCEPT NOTE DRAFT | PROVISIONAL UP DISTRICTS IDENTIFIED</w:t>
       </w:r>
     </w:p>
     <w:p>
       <w:r>
-        <w:t>Proposed 12-month CSR or donor-funded pilot in 3–5 low-performing Uttar Pradesh districts, to be selected after NFHS-5 analysis and field validation.</w:t>
+        <w:t>Proposed 12-month CSR or donor-funded pilot in Shrawasti, Lalitpur, Bahraich, Balrampur and Sitapur, subject to field validation and boundary review. These are the five lowest-ranked districts on a four-indicator NFHS-5 descriptive composite, not a finance index.</w:t>
       </w:r>
     </w:p>
     <w:p>
@@ -84,7 +84,7 @@
     </w:p>
     <w:p>
       <w:r>
-        <w:t>The NFHS-4 district compilation contains 59,241 district-indicator rows and 93 indicators according to the source repository documentation. (Source: data/raw/nfhs_district-wise.csv and data/raw/README.md.) NFHS-5 is required to identify the 3–5 lowest-performing UP districts and has not yet been downloaded. No UP ranking or district-specific problem estimate is asserted in this draft.</w:t>
+        <w:t>The NFHS-4 factsheet compilation contains 59,241 district-indicator rows; the user-supplied NFHS-5 workbook contributes 75,649 rows. In the NFHS-5 four-indicator mean-rank composite, the five lowest-ranked Uttar Pradesh districts are Shrawasti, Lalitpur, Bahraich, Balrampur and Sitapur. These are provisional planning candidates; field validation, local partner capacity and boundary review must inform final selection. (Sources: data/raw/nfhs_district-wise.csv; data/raw/NFHS_5_India_Districts_Factsheet_Data.xls; outputs/tables/up_district_rankings.csv.)</w:t>
       </w:r>
     </w:p>
     <w:p>
@@ -1070,7 +1070,7 @@
               <w:rPr>
                 <w:sz w:val="17"/>
               </w:rPr>
-              <w:t>NFHS-5 file or boundary crosswalk delays district selection</w:t>
+              <w:t>Composite omits financial inclusion measures</w:t>
             </w:r>
           </w:p>
         </w:tc>
@@ -1087,7 +1087,7 @@
               <w:rPr>
                 <w:sz w:val="17"/>
               </w:rPr>
-              <w:t>Do not announce geographies before verified analysis; use a transparent selection note.</w:t>
+              <w:t>Use the ranking only for initial screening; collect account-use and mobile-use evidence before final selection.</w:t>
             </w:r>
           </w:p>
         </w:tc>

</xml_diff>